<commit_message>
Add ThaiDateUtil; enhance UAT doc generator
Introduce a new Spring component ThaiDateUtil that provides Thai/Buddhist-era date formatting (various formats including seconds and date-only). Update many Thymeleaf templates (admin, academic, applicant, position, petition, logs, etc.) to replace ad-hoc #temporals.format calls with @thaiDateUtil.format* usages and add a small JS helper in activity_logs for showing Thai date labels for date inputs. Heavily refactor generate_word.py to produce a styled UAT Test Cases .docx: parse @Nested/@DisplayName tests, build metadata and steps tables with Thai fonts/formatting, and save UAT_Test_Cases.docx. Add/modify several document and upload binaries and supporting docs/scripts under docs/ and uploads/.
</commit_message>
<xml_diff>
--- a/HRCP-KKU-Academic/uploads/academic/9/doc_8.docx
+++ b/HRCP-KKU-Academic/uploads/academic/9/doc_8.docx
@@ -267,7 +267,7 @@
           <w:sz w:val="32"/>
           <w:szCs w:val="32"/>
         </w:rPr>
-        <w:t/>
+        <w:t>อว 660301.26.4/ว.</w:t>
       </w:r>
       <w:r>
         <w:rPr>
@@ -358,7 +358,7 @@
           <w:sz w:val="32"/>
           <w:szCs w:val="32"/>
         </w:rPr>
-        <w:t>21 มีนาคม 2569</w:t>
+        <w:t>23 มีนาคม 2569</w:t>
       </w:r>
       <w:r>
         <w:rPr>
@@ -586,7 +586,7 @@
           <w:sz w:val="32"/>
           <w:szCs w:val="32"/>
         </w:rPr>
-        <w:t>21 มีนาคม 2569</w:t>
+        <w:t>23 มีนาคม 2569</w:t>
       </w:r>
       <w:r>
         <w:rPr>
@@ -643,7 +643,7 @@
           <w:sz w:val="32"/>
           <w:szCs w:val="32"/>
         </w:rPr>
-        <w:t>dsa</w:t>
+        <w:t>การคำนวณควอนตัม</w:t>
       </w:r>
       <w:r>
         <w:rPr>
@@ -703,7 +703,7 @@
           <w:szCs w:val="32"/>
           <w:shd w:val="clear" w:color="auto" w:fill="FFFFFF"/>
         </w:rPr>
-        <w:t>dsa </w:t>
+        <w:t>CP 256 256 </w:t>
       </w:r>
       <w:r>
         <w:rPr>
@@ -754,7 +754,7 @@
           <w:szCs w:val="32"/>
           <w:lang w:eastAsia="en-GB"/>
         </w:rPr>
-        <w:t/>
+        <w:t>1/2569</w:t>
       </w:r>
       <w:r>
         <w:rPr>

</xml_diff>